<commit_message>
docs: humanize urbanpulse mid-term report
</commit_message>
<xml_diff>
--- a/Mid-Term.docx
+++ b/Mid-Term.docx
@@ -37,7 +37,7 @@
           <w:sz w:val="22"/>
           <w:szCs w:val="22"/>
         </w:rPr>
-        <w:t xml:space="preserve"> UrbanPulse ya logró algo que muchas startups GovTech no consiguen tan rápido: entrar a municipios reales y ordenar datos que antes estaban dispersos. Pero eso no alcanza para consolidar una propuesta fuerte. Si la plataforma sigue funcionando solo como un tablero que muestra información, va a quedar atrapada en una lógica de monitoreo sin impacto visible. Mi recomendación general sería reposicionar el producto como una capa de decisión operativa: menos lectura pasiva, más priorización, más ejecución y más evidencia de resultado.</w:t>
+        <w:t xml:space="preserve"> UrbanPulse ya consiguió algo valioso: entrar en municipios reales y ordenar información que antes estaba dispersa entre áreas, planillas y sistemas que casi no conversan entre sí. Pero hoy eso todavía alcanza para mostrar, no tanto para mover decisiones. El paso siguiente, si quiere crecer en serio, es bastante más exigente: lograr que la plataforma ayude a actuar mejor, que se use de verdad puertas adentro y que no dependa de una implementación casi artesanal cada vez que aparece una ciudad nueva.</w:t>
       </w:r>
     </w:p>
     <w:p>
@@ -65,33 +65,33 @@
           <w:sz w:val="22"/>
           <w:szCs w:val="22"/>
         </w:rPr>
-        <w:t>Mi primera recomendación para UrbanPulse sería no pensar el mercado público como un bloque homogéneo. En los municipios, la decisión de compra y la decisión de uso casi nunca pasan por las mismas personas. Por eso el descubrimiento de mercado tendría que enfocarse en entender tres niveles al mismo tiempo: quién siente el problema, quién ejecuta la respuesta y quién firma o habilita la inversión. Si la empresa solo valida interés en la capa política, puede conseguir reuniones; si solo valida dolor operativo, puede conseguir empatía. Pero para vender y sostener el producto necesita las dos cosas juntas.</w:t>
-      </w:r>
-    </w:p>
-    <w:p>
-      <w:pPr>
-        <w:spacing w:before="0" w:after="0" w:line="240" w:lineRule="auto"/>
-      </w:pPr>
-      <w:r>
-        <w:rPr>
-          <w:rFonts w:ascii="Arial" w:hAnsi="Arial" w:cs="Arial"/>
-          <w:sz w:val="22"/>
-          <w:szCs w:val="22"/>
-        </w:rPr>
-        <w:t>En la práctica, yo estructuraría ese descubrimiento con entrevistas semiestructuradas a secretarios, coordinadores y personal operativo; observación de procesos reales; análisis de incidentes recientes; y una medición bastante concreta de tiempos de respuesta, frecuencia de uso, resolución dentro de SLA y volumen de coordinación manual. No lo haría como un ejercicio académico, sino como una forma de detectar dónde UrbanPulse puede insertarse sin agregar fricción. En municipios argentinos, y especialmente en zonas de Buenos Aires, eso implica aceptar que la operación no siempre sigue un flujo formal: hay burocracia municipal, cadenas informales, llamados directos, punteros políticos que acercan reclamos y presupuestos acotados que obligan a justificar cada gasto. Ignorar eso sería diseñar para un municipio ideal que, en general, no existe.</w:t>
-      </w:r>
-    </w:p>
-    <w:p>
-      <w:pPr>
-        <w:spacing w:before="0" w:after="0" w:line="240" w:lineRule="auto"/>
-      </w:pPr>
-      <w:r>
-        <w:rPr>
-          <w:rFonts w:ascii="Arial" w:hAnsi="Arial" w:cs="Arial"/>
-          <w:sz w:val="22"/>
-          <w:szCs w:val="22"/>
-        </w:rPr>
-        <w:t>Si tuviera que priorizar hipótesis, empezaría por estas: que existe un caso de uso con suficiente dolor y repetición como para mostrar impacto en menos de 90 días; que el municipio percibe más valor en un sistema que ordena decisiones que en uno que solo reporta; que la integración mínima con sistemas heredados es viable sin convertir el proyecto en consultoría pesada; y que la adopción interna no se derrumba cuando el sistema empieza a modificar hábitos. Esta última hipótesis me parece especialmente importante, porque muchas veces se asume que si la tecnología funciona, la organización la va a incorporar. En un municipio eso no está garantizado. Puede haber áreas que no quieran ceder control, jefes que prefieran manejarse por teléfono y empleados que llevan años resolviendo del mismo modo. Si UrbanPulse no valida ese frente desde el inicio, puede malinterpretar señales positivas de interés como si ya fueran señales de adopción futura.</w:t>
+        <w:t>Si tuviera que marcar un punto de partida, sería este: UrbanPulse no debería leer al sector público como si fuera un cliente único y ordenado. Un municipio decide por capas. Hay actores políticos, áreas técnicas, coordinadores, gente de calle y también circuitos informales que pesan bastante más de lo que suele aparecer en una presentación comercial. Por eso el descubrimiento de mercado tendría que meterse en esa trama real. No alcanza con detectar que hay problemas en movilidad o residuos; hay que entender quién los sufre, quién responde, quién destraba recursos y quién termina frenando cambios cuando siente que pierde control.</w:t>
+      </w:r>
+    </w:p>
+    <w:p>
+      <w:pPr>
+        <w:spacing w:before="0" w:after="0" w:line="240" w:lineRule="auto"/>
+      </w:pPr>
+      <w:r>
+        <w:rPr>
+          <w:rFonts w:ascii="Arial" w:hAnsi="Arial" w:cs="Arial"/>
+          <w:sz w:val="22"/>
+          <w:szCs w:val="22"/>
+        </w:rPr>
+        <w:t>En términos prácticos, trabajaría con entrevistas semiestructuradas, observación de la operación diaria, revisión de incidentes recientes y una reconstrucción bastante concreta de cómo se resuelve hoy un problema desde que aparece hasta que se cierra. A eso le sumaría algunos datos básicos, pero útiles: tiempos de respuesta, frecuencia de uso de la plataforma, porcentaje de incidentes resueltos dentro de SLA y nivel de dependencia de llamadas, WhatsApp o planillas manuales. En municipios argentinos, sobre todo en Buenos Aires y el conurbano, ese mapa rara vez es limpio. Hay burocracia municipal, reclamos que entran por canales paralelos, punteros políticos que acercan demandas de vecinos y presupuestos ajustados que vuelven muy difícil defender cualquier compra si no muestra resultados rápido.</w:t>
+      </w:r>
+    </w:p>
+    <w:p>
+      <w:pPr>
+        <w:spacing w:before="0" w:after="0" w:line="240" w:lineRule="auto"/>
+      </w:pPr>
+      <w:r>
+        <w:rPr>
+          <w:rFonts w:ascii="Arial" w:hAnsi="Arial" w:cs="Arial"/>
+          <w:sz w:val="22"/>
+          <w:szCs w:val="22"/>
+        </w:rPr>
+        <w:t>Las hipótesis que conviene validar primero no son muchas, pero sí bastante delicadas. La primera es si existe un caso de uso con dolor claro, frecuencia suficiente y visibilidad política como para justificar una prueba seria. La segunda es si el municipio realmente valora una herramienta que ordena decisiones, o si sigue viendo más cómodo un tablero que no le cambie demasiado la rutina. La tercera tiene que ver con los sistemas heredados: si la integración mínima necesita meses de trabajo, el modelo se complica enseguida. Y hay una cuarta hipótesis que me parece fácil de subestimar: la gente adentro del municipio tiene que querer usar esto. No por convicción abstracta, sino porque le resuelve algo. Si no, el interés inicial puede estar y la adopción igual quedarse corta.</w:t>
       </w:r>
     </w:p>
     <w:p>
@@ -119,20 +119,20 @@
           <w:sz w:val="22"/>
           <w:szCs w:val="22"/>
         </w:rPr>
-        <w:t>Si miro el problema desde experiencia de usuario, la principal debilidad no parece ser estética sino funcional. El dashboard actual seguramente ofrece visibilidad, pero obliga al usuario a hacer casi todo el trabajo importante por su cuenta: interpretar datos, decidir prioridad y coordinar acciones por fuera del sistema. Mi recomendación sería cambiar esa lógica de raíz. La plataforma debería comportarse menos como un panel y más como una mesa de control operativa, donde el usuario entre y entienda en pocos segundos qué está pasando, qué es urgente y qué acción concreta tiene disponible.</w:t>
-      </w:r>
-    </w:p>
-    <w:p>
-      <w:pPr>
-        <w:spacing w:before="0" w:after="0" w:line="240" w:lineRule="auto"/>
-      </w:pPr>
-      <w:r>
-        <w:rPr>
-          <w:rFonts w:ascii="Arial" w:hAnsi="Arial" w:cs="Arial"/>
-          <w:sz w:val="22"/>
-          <w:szCs w:val="22"/>
-        </w:rPr>
-        <w:t>Eso implica reorganizar la experiencia alrededor de incidentes priorizados, responsables, impacto esperado y próximos pasos, en lugar de descansar tanto en gráficos o métricas sueltas. También separaría claramente las vistas por rol. Un secretario necesita panorama y riesgo político; un coordinador operativo necesita decidir rápido; un analista quizás sí necesita mayor profundidad. Si todo se muestra igual para todos, la plataforma corre el riesgo de servir poco a cada perfil. Además, haría algo que me parece clave: diseñar la experiencia pensando en resistencia al cambio. Un empleado municipal que lleva veinte años resolviendo por teléfono, papel o WhatsApp no va a cambiar porque la interfaz sea más linda. Va a cambiar si siente que evita doble carga, que le simplifica trabajo y que no lo deja expuesto si algo sale mal. Ahí la UX deja de ser diseño de pantalla y pasa a ser diseño de confianza.</w:t>
+        <w:t>El problema de experiencia no parece estar solo en la interfaz. Más bien está en la carga de trabajo que el producto le deja al usuario. El dashboard informa, sí, pero después alguien tiene que mirar los datos, interpretar qué es urgente, decidir prioridad y ponerse a coordinar por afuera. Ahí se corta buena parte del valor. Un secretario, un coordinador o un supervisor operativo no entra a una plataforma para contemplar gráficos. Entra para entender rápido qué pasó y qué conviene hacer con eso.</w:t>
+      </w:r>
+    </w:p>
+    <w:p>
+      <w:pPr>
+        <w:spacing w:before="0" w:after="0" w:line="240" w:lineRule="auto"/>
+      </w:pPr>
+      <w:r>
+        <w:rPr>
+          <w:rFonts w:ascii="Arial" w:hAnsi="Arial" w:cs="Arial"/>
+          <w:sz w:val="22"/>
+          <w:szCs w:val="22"/>
+        </w:rPr>
+        <w:t>Yo movería la lógica de uso hacia una pantalla más orientada a incidentes, prioridades y acciones concretas. Menos lectura general; más señal útil. Qué está pasando, dónde, con qué impacto probable, quién debería tomarlo y qué siguiente paso tiene sentido. Eso además tendría que variar según el rol. No hace falta darle la misma vista a un funcionario político que a alguien que organiza cuadrillas. También sería prudente asumir que una parte de la resistencia no se va a resolver con diseño visual. Si una persona trabajó veinte años con teléfono, papel o grupos de WhatsApp, no cambia de golpe porque el sistema esté mejor presentado. Cambia cuando siente que le ahorra tiempo, le evita dobles cargas y le deja menos margen para quedar expuesto si algo falla.</w:t>
       </w:r>
     </w:p>
     <w:p>
@@ -160,20 +160,20 @@
           <w:sz w:val="22"/>
           <w:szCs w:val="22"/>
         </w:rPr>
-        <w:t>Mi recomendación acá sería avanzar con una automatización progresiva y no con una promesa demasiado ambiciosa desde el día uno. UrbanPulse debería construir un flujo claro: los datos ingresan desde sensores, GPS, sistemas legacy y reclamos ciudadanos; se normalizan en una capa interoperable; pasan por un motor que combina reglas con IA; y de ahí salen prioridades, tickets, alertas o acciones sugeridas. El punto importante es que la salida del sistema no sea solo información, sino capacidad de actuar. Si la IA detecta algo pero después todo vuelve al circuito manual, el salto de valor va a ser muy limitado.</w:t>
-      </w:r>
-    </w:p>
-    <w:p>
-      <w:pPr>
-        <w:spacing w:before="0" w:after="0" w:line="240" w:lineRule="auto"/>
-      </w:pPr>
-      <w:r>
-        <w:rPr>
-          <w:rFonts w:ascii="Arial" w:hAnsi="Arial" w:cs="Arial"/>
-          <w:sz w:val="22"/>
-          <w:szCs w:val="22"/>
-        </w:rPr>
-        <w:t>Ahora bien, no automatizaría cualquier cosa al principio. Empezaría por procesos repetitivos y de baja ambigüedad, como desvíos de rutas, sensores fuera de rango, incidentes recurrentes o reportes operativos que hoy se consolidan a mano. Son casos donde el beneficio es visible y el riesgo político es menor. En cambio, las decisiones más sensibles deberían mantener human-in-the-loop. No solo por prudencia técnica, sino por realismo institucional. Si un encargado municipal siente que el sistema le reemplaza el criterio que construyó durante veinte años, lo más probable es que se cierre. Si, en cambio, la plataforma lo ayuda a detectar antes, ordenar mejor y decidir con más respaldo, la conversación cambia. En este punto, para mí, la automatización no debería venderse como reemplazo del funcionario, sino como una forma de reducir fricción operativa y liberar tiempo para decisiones más relevantes.</w:t>
+        <w:t>Acá UrbanPulse tiene una oportunidad clara, pero conviene no exagerarla. La automatización sirve cuando cae sobre procesos bastante repetitivos y con reglas más o menos claras. Si los datos entran desde sensores, GPS, sistemas legacy y reclamos ciudadanos, lo lógico es que primero pasen por una capa de normalización. Después sí, tiene sentido combinarlos con reglas y modelos de IA para detectar anomalías, ordenar prioridades y sugerir respuestas. El punto no es que el sistema 'entienda la ciudad' en abstracto. El punto es que avise a tiempo, ordene mejor el trabajo y dispare una acción útil sin sumar más vueltas.</w:t>
+      </w:r>
+    </w:p>
+    <w:p>
+      <w:pPr>
+        <w:spacing w:before="0" w:after="0" w:line="240" w:lineRule="auto"/>
+      </w:pPr>
+      <w:r>
+        <w:rPr>
+          <w:rFonts w:ascii="Arial" w:hAnsi="Arial" w:cs="Arial"/>
+          <w:sz w:val="22"/>
+          <w:szCs w:val="22"/>
+        </w:rPr>
+        <w:t>Yo arrancaría por casos concretos: desvíos en rutas de recolección, sensores fuera de rango, incidentes repetidos en una zona o reportes diarios que hoy alguien arma a mano. Ahí se puede mostrar valor rápido. En cambio, las decisiones con impacto político o con información dudosa deberían seguir teniendo revisión humana. No solo por cuidado técnico. También por una cuestión bastante terrenal: si un empleado municipal que lleva años resolviendo recorridos 'a ojo' siente que el sistema viene a reemplazarlo, probablemente lo rechace. Si lo ve como un apoyo para ordenar trabajo repetitivo y llegar mejor parado a decisiones más sensibles, la conversación cambia bastante. Por eso no me parece razonable vender la automatización como sustitución. En este contexto funciona mejor como asistencia con supervisión.</w:t>
       </w:r>
     </w:p>
     <w:p>
@@ -201,7 +201,7 @@
           <w:sz w:val="22"/>
           <w:szCs w:val="22"/>
         </w:rPr>
-        <w:t>Si UrbanPulse quiere crecer, necesita demostrar impacto con indicadores que un municipio pueda entender rápido y defender internamente. Mi primera recomendación sería seguir el tiempo promedio entre detección y resolución del incidente. Es una métrica concreta, conecta con la operación y permite mostrar mejora sin demasiada interpretación. La segunda sería medir cuántos incidentes del proceso cubierto se gestionan efectivamente dentro de la plataforma, junto con usuarios activos semanales por rol. Eso sirve para no confundirse: una cosa es tener logins, otra muy distinta es formar parte del trabajo real. La tercera métrica la orientaría al negocio: tiempo de implementación por nueva ciudad y conversión de piloto a contrato pago. Si esos números no mejoran, la empresa puede tener un producto interesante pero todavía débil como modelo escalable.</w:t>
+        <w:t>Si UrbanPulse quiere demostrar impacto, necesita indicadores que no requieran una explicación demasiado sofisticada. El primero, para mí, sería el tiempo promedio entre detección y resolución del incidente. Si ese tiempo baja, hay una mejora concreta. El segundo debería mirar adopción real: cuántos incidentes del proceso cubierto se gestionan dentro de la plataforma y cuántos usuarios activos semanales hay por perfil. Eso ayuda a distinguir entre una herramienta que se consulta y una herramienta que se usa de verdad. El tercero lo llevaría al plano comercial: cuánto tarda la implementación en una nueva ciudad y cuántos pilotos terminan convirtiéndose en contratos. Sin eso, la empresa puede tener buen discurso y aún así quedar trabada en crecimiento lento.</w:t>
       </w:r>
     </w:p>
     <w:p>
@@ -229,20 +229,20 @@
           <w:sz w:val="22"/>
           <w:szCs w:val="22"/>
         </w:rPr>
-        <w:t>Mi recomendación estratégica para escalar sería separar con mucha disciplina lo que UrbanPulse tiene que estandarizar de lo que debe dejar configurable. La base debería ser común: conectores reutilizables, modelo de datos urbano, motor de reglas e IA, automatizaciones frecuentes y vistas por rol. Sobre esa base, cada ciudad tendría que ajustar umbrales, responsables, fuentes y particularidades operativas sin tocar el núcleo del producto. Si cada implementación obliga a rediseñar integraciones, flujos o taxonomías, la empresa crece más como consultora que como plataforma.</w:t>
-      </w:r>
-    </w:p>
-    <w:p>
-      <w:pPr>
-        <w:spacing w:before="0" w:after="0" w:line="240" w:lineRule="auto"/>
-      </w:pPr>
-      <w:r>
-        <w:rPr>
-          <w:rFonts w:ascii="Arial" w:hAnsi="Arial" w:cs="Arial"/>
-          <w:sz w:val="22"/>
-          <w:szCs w:val="22"/>
-        </w:rPr>
-        <w:t>En ese esquema, las APIs cumplen un rol mucho más estratégico que técnico. Son las que permiten convivir con sistemas municipales viejos, sumar fuentes nuevas y evitar que cada despliegue arranque desde cero. En Argentina eso pesa mucho, porque rara vez un municipio tiene una arquitectura ordenada. Lo normal es encontrar software heredado, soluciones compradas en momentos distintos y dependencias que se manejan con poca integración entre sí. Por eso la interoperabilidad no es un plus: es una condición de supervivencia del producto. Para evitar soluciones no replicables, UrbanPulse debería apoyarse en conectores estándar, reglas configurables, playbooks de despliegue y un catálogo acotado de casos de uso iniciales. La clave sería configurar más y desarrollar menos.</w:t>
+        <w:t>Acá el riesgo es bastante concreto: que cada ciudad obligue a rehacer demasiadas cosas. Si eso pasa, UrbanPulse se vuelve una empresa de proyectos especiales y no una plataforma con capacidad de repetirse. Yo separaría con cuidado qué tiene que quedar fijo y qué puede configurarse. Debería haber una base común de conectores, modelo de datos, reglas frecuentes, automatizaciones y vistas por rol. Después sí, cada municipio puede ajustar umbrales, responsables, fuentes disponibles o nombres internos sin tocar el núcleo del producto.</w:t>
+      </w:r>
+    </w:p>
+    <w:p>
+      <w:pPr>
+        <w:spacing w:before="0" w:after="0" w:line="240" w:lineRule="auto"/>
+      </w:pPr>
+      <w:r>
+        <w:rPr>
+          <w:rFonts w:ascii="Arial" w:hAnsi="Arial" w:cs="Arial"/>
+          <w:sz w:val="22"/>
+          <w:szCs w:val="22"/>
+        </w:rPr>
+        <w:t>Las APIs cumplen un papel central porque permiten convivir con la realidad tecnológica de los municipios, que rara vez es prolija. Lo habitual es encontrar software comprado en momentos distintos, bases que no hablan entre sí, planillas paralelas y procesos inventados sobre la marcha para cubrir huecos. Si UrbanPulse no resuelve bien esa convivencia, cualquier despliegue nuevo se vuelve lento y costoso. Para evitarlo, yo trabajaría con conectores reutilizables, reglas configurables, playbooks de implementación y un conjunto corto de casos de uso iniciales. No parece glamoroso, pero probablemente sea mucho más útil que prometer una plataforma total desde el primer día.</w:t>
       </w:r>
     </w:p>
     <w:p>
@@ -270,7 +270,7 @@
           <w:sz w:val="22"/>
           <w:szCs w:val="22"/>
         </w:rPr>
-        <w:t>Si tuviera que resumir la estrategia, diría que UrbanPulse debería concentrarse en un caso de uso bandera, rediseñar su experiencia alrededor de la acción, automatizar con gradualidad y demostrar impacto con pocos indicadores muy claros. La oportunidad existe, pero no se va a capturar solo por tener más datos o mejores modelos. Se va a capturar si la plataforma logra meterse en el corazón de la operación municipal sin volverse pesada, sin chocar innecesariamente con hábitos instalados y sin depender de implementaciones imposibles de repetir. Ahí está, para mí, el verdadero salto: pasar de una solución interesante a una herramienta realmente necesaria.</w:t>
+        <w:t>Mi impresión es que UrbanPulse no necesita reinventarse por completo. Necesita moverse unos pasos más allá de donde está. Hoy ya puede mostrar visibilidad; ahora tiene que probar que esa visibilidad ordena mejor la operación, baja tiempos de respuesta y se integra sin romper el trabajo cotidiano de quienes están adentro del municipio. Si consigue eso en uno o dos casos bien elegidos, va a tener algo mucho más fuerte que un buen discurso comercial. Va a tener evidencia.</w:t>
       </w:r>
     </w:p>
     <w:p>
@@ -321,7 +321,7 @@
           <w:sz w:val="22"/>
           <w:szCs w:val="22"/>
         </w:rPr>
-        <w:t xml:space="preserve"> UrbanPulse no necesita abandonar lo que ya construyó, sino llevarlo a una versión más madura. La visibilidad fue un buen punto de entrada. Pero el crecimiento va a depender de algo más exigente: convertir esa visibilidad en decisiones y resultados que un municipio pueda sentir en la práctica. Si logra eso, va a tener más adopción, más argumento comercial y más chances reales de escalar en la región.</w:t>
+        <w:t xml:space="preserve"> El desafío de UrbanPulse no es solamente técnico. También es organizacional y político. Tiene que entrar en estructuras lentas, con hábitos viejos, recursos finitos y bastante sensibilidad al error. Justamente por eso, si logra que el producto funcione en ese terreno, el valor que construya puede ser muy difícil de reemplazar.</w:t>
       </w:r>
     </w:p>
     <w:sectPr>

</xml_diff>

<commit_message>
docs: refine urbanpulse report tone
</commit_message>
<xml_diff>
--- a/Mid-Term.docx
+++ b/Mid-Term.docx
@@ -37,7 +37,7 @@
           <w:sz w:val="22"/>
           <w:szCs w:val="22"/>
         </w:rPr>
-        <w:t xml:space="preserve"> UrbanPulse ya consiguió algo valioso: entrar en municipios reales y ordenar información que antes estaba dispersa entre áreas, planillas y sistemas que casi no conversan entre sí. Pero hoy eso todavía alcanza para mostrar, no tanto para mover decisiones. El paso siguiente, si quiere crecer en serio, es bastante más exigente: lograr que la plataforma ayude a actuar mejor, que se use de verdad puertas adentro y que no dependa de una implementación casi artesanal cada vez que aparece una ciudad nueva.</w:t>
+        <w:t xml:space="preserve"> UrbanPulse ya hizo una parte difícil: entrar a municipios concretos y juntar información que, en muchos casos, estaba repartida entre áreas, planillas y sistemas viejos. El problema es que eso, por ahora, sirve bastante para mirar y menos para decidir. Si la empresa quiere crecer, probablemente tenga que correrse de ese lugar. No alcanza con mostrar lo que pasa. Tiene que ayudar a que algo pase después.</w:t>
       </w:r>
     </w:p>
     <w:p>
@@ -65,33 +65,33 @@
           <w:sz w:val="22"/>
           <w:szCs w:val="22"/>
         </w:rPr>
-        <w:t>Si tuviera que marcar un punto de partida, sería este: UrbanPulse no debería leer al sector público como si fuera un cliente único y ordenado. Un municipio decide por capas. Hay actores políticos, áreas técnicas, coordinadores, gente de calle y también circuitos informales que pesan bastante más de lo que suele aparecer en una presentación comercial. Por eso el descubrimiento de mercado tendría que meterse en esa trama real. No alcanza con detectar que hay problemas en movilidad o residuos; hay que entender quién los sufre, quién responde, quién destraba recursos y quién termina frenando cambios cuando siente que pierde control.</w:t>
-      </w:r>
-    </w:p>
-    <w:p>
-      <w:pPr>
-        <w:spacing w:before="0" w:after="0" w:line="240" w:lineRule="auto"/>
-      </w:pPr>
-      <w:r>
-        <w:rPr>
-          <w:rFonts w:ascii="Arial" w:hAnsi="Arial" w:cs="Arial"/>
-          <w:sz w:val="22"/>
-          <w:szCs w:val="22"/>
-        </w:rPr>
-        <w:t>En términos prácticos, trabajaría con entrevistas semiestructuradas, observación de la operación diaria, revisión de incidentes recientes y una reconstrucción bastante concreta de cómo se resuelve hoy un problema desde que aparece hasta que se cierra. A eso le sumaría algunos datos básicos, pero útiles: tiempos de respuesta, frecuencia de uso de la plataforma, porcentaje de incidentes resueltos dentro de SLA y nivel de dependencia de llamadas, WhatsApp o planillas manuales. En municipios argentinos, sobre todo en Buenos Aires y el conurbano, ese mapa rara vez es limpio. Hay burocracia municipal, reclamos que entran por canales paralelos, punteros políticos que acercan demandas de vecinos y presupuestos ajustados que vuelven muy difícil defender cualquier compra si no muestra resultados rápido.</w:t>
-      </w:r>
-    </w:p>
-    <w:p>
-      <w:pPr>
-        <w:spacing w:before="0" w:after="0" w:line="240" w:lineRule="auto"/>
-      </w:pPr>
-      <w:r>
-        <w:rPr>
-          <w:rFonts w:ascii="Arial" w:hAnsi="Arial" w:cs="Arial"/>
-          <w:sz w:val="22"/>
-          <w:szCs w:val="22"/>
-        </w:rPr>
-        <w:t>Las hipótesis que conviene validar primero no son muchas, pero sí bastante delicadas. La primera es si existe un caso de uso con dolor claro, frecuencia suficiente y visibilidad política como para justificar una prueba seria. La segunda es si el municipio realmente valora una herramienta que ordena decisiones, o si sigue viendo más cómodo un tablero que no le cambie demasiado la rutina. La tercera tiene que ver con los sistemas heredados: si la integración mínima necesita meses de trabajo, el modelo se complica enseguida. Y hay una cuarta hipótesis que me parece fácil de subestimar: la gente adentro del municipio tiene que querer usar esto. No por convicción abstracta, sino porque le resuelve algo. Si no, el interés inicial puede estar y la adopción igual quedarse corta.</w:t>
+        <w:t>Yo arrancaría por una idea bastante simple: un municipio no funciona como un cliente único. Funciona por capas, por relaciones, por áreas que a veces se pisan entre sí. Hay decisión política, gestión operativa, reclamos vecinales, urgencias del día y bastante burocracia municipal entre medio. En Buenos Aires, o al menos en muchos municipios del conurbano, eso además convive con canales informales, llamados directos y punteros políticos que acercan pedidos sin pasar por el circuito prolijo que uno dibujaría en una presentación. Si UrbanPulse no entra a esa realidad, va a leer mal el mercado.</w:t>
+      </w:r>
+    </w:p>
+    <w:p>
+      <w:pPr>
+        <w:spacing w:before="0" w:after="0" w:line="240" w:lineRule="auto"/>
+      </w:pPr>
+      <w:r>
+        <w:rPr>
+          <w:rFonts w:ascii="Arial" w:hAnsi="Arial" w:cs="Arial"/>
+          <w:sz w:val="22"/>
+          <w:szCs w:val="22"/>
+        </w:rPr>
+        <w:t>Por eso el descubrimiento no debería quedarse en entrevistas lindas con funcionarios. Haría entrevistas, sí, pero también miraría jornadas reales, revisaría incidentes recientes y trataría de reconstruir cómo se resuelve hoy un problema desde que aparece hasta que alguien lo cierra, si es que se cierra. Sumado a eso, conviene medir algunas cosas bastante terrenales: cuánto tarda una respuesta, cuántos incidentes siguen resolviéndose por WhatsApp o teléfono, cuánta gente entra de verdad a la plataforma y qué parte del trabajo sigue ocurriendo por afuera. En la práctica, eso dice más que cualquier discurso de innovación.</w:t>
+      </w:r>
+    </w:p>
+    <w:p>
+      <w:pPr>
+        <w:spacing w:before="0" w:after="0" w:line="240" w:lineRule="auto"/>
+      </w:pPr>
+      <w:r>
+        <w:rPr>
+          <w:rFonts w:ascii="Arial" w:hAnsi="Arial" w:cs="Arial"/>
+          <w:sz w:val="22"/>
+          <w:szCs w:val="22"/>
+        </w:rPr>
+        <w:t>Las hipótesis a validar primero, para mí, son pocas. Pero pesan. La primera: si hay un caso de uso con suficiente dolor, repetición y visibilidad como para justificar una prueba seria. La segunda: si el municipio valora una herramienta que empuje decisiones o si, por momentos, prefiere algo más pasivo que no altere tanto su rutina. La tercera: si la integración mínima con sistemas legacy puede hacerse sin abrir un proyecto eterno. Y hay otra más, que a veces se subestima: si la gente la va a usar cuando deje de ser novedad. Depende bastante de eso. Un interés inicial no garantiza mucho.</w:t>
       </w:r>
     </w:p>
     <w:p>
@@ -119,20 +119,20 @@
           <w:sz w:val="22"/>
           <w:szCs w:val="22"/>
         </w:rPr>
-        <w:t>El problema de experiencia no parece estar solo en la interfaz. Más bien está en la carga de trabajo que el producto le deja al usuario. El dashboard informa, sí, pero después alguien tiene que mirar los datos, interpretar qué es urgente, decidir prioridad y ponerse a coordinar por afuera. Ahí se corta buena parte del valor. Un secretario, un coordinador o un supervisor operativo no entra a una plataforma para contemplar gráficos. Entra para entender rápido qué pasó y qué conviene hacer con eso.</w:t>
-      </w:r>
-    </w:p>
-    <w:p>
-      <w:pPr>
-        <w:spacing w:before="0" w:after="0" w:line="240" w:lineRule="auto"/>
-      </w:pPr>
-      <w:r>
-        <w:rPr>
-          <w:rFonts w:ascii="Arial" w:hAnsi="Arial" w:cs="Arial"/>
-          <w:sz w:val="22"/>
-          <w:szCs w:val="22"/>
-        </w:rPr>
-        <w:t>Yo movería la lógica de uso hacia una pantalla más orientada a incidentes, prioridades y acciones concretas. Menos lectura general; más señal útil. Qué está pasando, dónde, con qué impacto probable, quién debería tomarlo y qué siguiente paso tiene sentido. Eso además tendría que variar según el rol. No hace falta darle la misma vista a un funcionario político que a alguien que organiza cuadrillas. También sería prudente asumir que una parte de la resistencia no se va a resolver con diseño visual. Si una persona trabajó veinte años con teléfono, papel o grupos de WhatsApp, no cambia de golpe porque el sistema esté mejor presentado. Cambia cuando siente que le ahorra tiempo, le evita dobles cargas y le deja menos margen para quedar expuesto si algo falla.</w:t>
+        <w:t>El problema de uso no parece estar solamente en la interfaz. Está, más bien, en todo lo que el sistema todavía le pide al usuario después de mostrarle información. El dashboard avisa, pero alguien tiene que leer, interpretar, comparar, decidir prioridad y salir a mover gente por afuera. Ahí se pierde tiempo. También se pierde interés. Un coordinador operativo no entra a una plataforma para mirar gráficos con calma; entra para resolver algo que ya le está cayendo encima.</w:t>
+      </w:r>
+    </w:p>
+    <w:p>
+      <w:pPr>
+        <w:spacing w:before="0" w:after="0" w:line="240" w:lineRule="auto"/>
+      </w:pPr>
+      <w:r>
+        <w:rPr>
+          <w:rFonts w:ascii="Arial" w:hAnsi="Arial" w:cs="Arial"/>
+          <w:sz w:val="22"/>
+          <w:szCs w:val="22"/>
+        </w:rPr>
+        <w:t>Yo llevaría la experiencia hacia una lógica bastante más directa: incidentes visibles, prioridad clara, responsable probable y una acción posible. No mucho más al principio. Después, según el rol, se puede abrir detalle. Porque tampoco necesita lo mismo un secretario que alguien que organiza cuadrillas o transporte. Y además hay algo que no conviene romantizar: la resistencia al cambio. Si una persona trabajó veinte años por teléfono, papel, radio o grupos de WhatsApp, no va a cambiar porque la pantalla esté mejor diseñada. Va a cambiar, quizá, si siente que el sistema le evita trabajo repetido, le ordena el día y no le complica más las cosas.</w:t>
       </w:r>
     </w:p>
     <w:p>
@@ -160,20 +160,20 @@
           <w:sz w:val="22"/>
           <w:szCs w:val="22"/>
         </w:rPr>
-        <w:t>Acá UrbanPulse tiene una oportunidad clara, pero conviene no exagerarla. La automatización sirve cuando cae sobre procesos bastante repetitivos y con reglas más o menos claras. Si los datos entran desde sensores, GPS, sistemas legacy y reclamos ciudadanos, lo lógico es que primero pasen por una capa de normalización. Después sí, tiene sentido combinarlos con reglas y modelos de IA para detectar anomalías, ordenar prioridades y sugerir respuestas. El punto no es que el sistema 'entienda la ciudad' en abstracto. El punto es que avise a tiempo, ordene mejor el trabajo y dispare una acción útil sin sumar más vueltas.</w:t>
-      </w:r>
-    </w:p>
-    <w:p>
-      <w:pPr>
-        <w:spacing w:before="0" w:after="0" w:line="240" w:lineRule="auto"/>
-      </w:pPr>
-      <w:r>
-        <w:rPr>
-          <w:rFonts w:ascii="Arial" w:hAnsi="Arial" w:cs="Arial"/>
-          <w:sz w:val="22"/>
-          <w:szCs w:val="22"/>
-        </w:rPr>
-        <w:t>Yo arrancaría por casos concretos: desvíos en rutas de recolección, sensores fuera de rango, incidentes repetidos en una zona o reportes diarios que hoy alguien arma a mano. Ahí se puede mostrar valor rápido. En cambio, las decisiones con impacto político o con información dudosa deberían seguir teniendo revisión humana. No solo por cuidado técnico. También por una cuestión bastante terrenal: si un empleado municipal que lleva años resolviendo recorridos 'a ojo' siente que el sistema viene a reemplazarlo, probablemente lo rechace. Si lo ve como un apoyo para ordenar trabajo repetitivo y llegar mejor parado a decisiones más sensibles, la conversación cambia bastante. Por eso no me parece razonable vender la automatización como sustitución. En este contexto funciona mejor como asistencia con supervisión.</w:t>
+        <w:t>Con IA y automatización yo sería bastante prudente, al menos al principio. UrbanPulse puede usar esos recursos, claro, pero sobre procesos donde el beneficio sea visible y el margen de error sea manejable. Si entran datos de sensores, GPS, sistemas viejos y reclamos ciudadanos, primero hay que ordenarlos. Recién después tiene sentido aplicar reglas y modelos para detectar anomalías, marcar prioridades o sugerir respuestas. Si esa cadena falla al comienzo, lo demás se ensucia rápido.</w:t>
+      </w:r>
+    </w:p>
+    <w:p>
+      <w:pPr>
+        <w:spacing w:before="0" w:after="0" w:line="240" w:lineRule="auto"/>
+      </w:pPr>
+      <w:r>
+        <w:rPr>
+          <w:rFonts w:ascii="Arial" w:hAnsi="Arial" w:cs="Arial"/>
+          <w:sz w:val="22"/>
+          <w:szCs w:val="22"/>
+        </w:rPr>
+        <w:t>Arrancaría por situaciones concretas: desvíos en rutas de recolección, sensores fuera de rango, incidentes repetidos en una misma zona, reportes que alguien hoy arma a mano. Ahí puede haber resultado rápido. En cambio, las decisiones más sensibles deberían seguir pasando por revisión humana. Hay una cuestión técnica, claro. Pero también pasa algo bastante obvio: si un empleado municipal siente que el sistema le viene a sacar criterio o lugar, se va a defender. Y con razón, desde su punto de vista. En esos casos, probablemente funcione mejor presentar la automatización como una ayuda para limpiar trabajo rutinario, no como una sustitución elegante de la experiencia acumulada.</w:t>
       </w:r>
     </w:p>
     <w:p>
@@ -201,7 +201,7 @@
           <w:sz w:val="22"/>
           <w:szCs w:val="22"/>
         </w:rPr>
-        <w:t>Si UrbanPulse quiere demostrar impacto, necesita indicadores que no requieran una explicación demasiado sofisticada. El primero, para mí, sería el tiempo promedio entre detección y resolución del incidente. Si ese tiempo baja, hay una mejora concreta. El segundo debería mirar adopción real: cuántos incidentes del proceso cubierto se gestionan dentro de la plataforma y cuántos usuarios activos semanales hay por perfil. Eso ayuda a distinguir entre una herramienta que se consulta y una herramienta que se usa de verdad. El tercero lo llevaría al plano comercial: cuánto tarda la implementación en una nueva ciudad y cuántos pilotos terminan convirtiéndose en contratos. Sin eso, la empresa puede tener buen discurso y aún así quedar trabada en crecimiento lento.</w:t>
+        <w:t>Si UrbanPulse quiere mostrar impacto real, necesita pocos indicadores y bien elegidos. Yo seguiría primero el tiempo promedio entre detección y resolución del incidente. Es bastante concreto. Después miraría adopción real: cuántos incidentes del proceso cubierto se gestionan dentro de la plataforma y cuántos usuarios activos semanales hay por perfil. Eso permite ver si el sistema quedó adentro del trabajo o si sigue orbitando por afuera. El tercer dato lo pondría del lado comercial: cuánto tarda una implementación nueva y cuántos pilotos terminan en contrato. No hace falta adornarlo demasiado. Si esos números no mejoran, algo sigue flojo.</w:t>
       </w:r>
     </w:p>
     <w:p>
@@ -229,20 +229,20 @@
           <w:sz w:val="22"/>
           <w:szCs w:val="22"/>
         </w:rPr>
-        <w:t>Acá el riesgo es bastante concreto: que cada ciudad obligue a rehacer demasiadas cosas. Si eso pasa, UrbanPulse se vuelve una empresa de proyectos especiales y no una plataforma con capacidad de repetirse. Yo separaría con cuidado qué tiene que quedar fijo y qué puede configurarse. Debería haber una base común de conectores, modelo de datos, reglas frecuentes, automatizaciones y vistas por rol. Después sí, cada municipio puede ajustar umbrales, responsables, fuentes disponibles o nombres internos sin tocar el núcleo del producto.</w:t>
-      </w:r>
-    </w:p>
-    <w:p>
-      <w:pPr>
-        <w:spacing w:before="0" w:after="0" w:line="240" w:lineRule="auto"/>
-      </w:pPr>
-      <w:r>
-        <w:rPr>
-          <w:rFonts w:ascii="Arial" w:hAnsi="Arial" w:cs="Arial"/>
-          <w:sz w:val="22"/>
-          <w:szCs w:val="22"/>
-        </w:rPr>
-        <w:t>Las APIs cumplen un papel central porque permiten convivir con la realidad tecnológica de los municipios, que rara vez es prolija. Lo habitual es encontrar software comprado en momentos distintos, bases que no hablan entre sí, planillas paralelas y procesos inventados sobre la marcha para cubrir huecos. Si UrbanPulse no resuelve bien esa convivencia, cualquier despliegue nuevo se vuelve lento y costoso. Para evitarlo, yo trabajaría con conectores reutilizables, reglas configurables, playbooks de implementación y un conjunto corto de casos de uso iniciales. No parece glamoroso, pero probablemente sea mucho más útil que prometer una plataforma total desde el primer día.</w:t>
+        <w:t>El problema acá es fácil de imaginar: que cada ciudad obligue a rearmar demasiado. Si eso pasa, el modelo se empieza a parecer más a una consultora que a un producto. Yo dejaría una base común bien definida —conectores, modelo de datos, algunas reglas frecuentes, automatizaciones y vistas por rol— y trataría de que lo local quede en parámetros, responsables, nombres internos, umbrales. No mucho más. Porque si cada despliegue toca el corazón del sistema, después cuesta salir de ahí.</w:t>
+      </w:r>
+    </w:p>
+    <w:p>
+      <w:pPr>
+        <w:spacing w:before="0" w:after="0" w:line="240" w:lineRule="auto"/>
+      </w:pPr>
+      <w:r>
+        <w:rPr>
+          <w:rFonts w:ascii="Arial" w:hAnsi="Arial" w:cs="Arial"/>
+          <w:sz w:val="22"/>
+          <w:szCs w:val="22"/>
+        </w:rPr>
+        <w:t>Las APIs son importantes por una razón bastante práctica: permiten convivir con entornos municipales que, en general, vienen desordenados. Hay software comprado en años distintos, bases que no se hablan, planillas que quedaron como parche y circuitos medio improvisados. UrbanPulse va a tener que vivir con eso. Entonces conviene trabajar con conectores reutilizables, reglas configurables y casos de uso iniciales bastante acotados. Puede sonar menos ambicioso, sí. Pero probablemente sea más útil, sobre todo cuando el presupuesto es corto y la paciencia institucional también.</w:t>
       </w:r>
     </w:p>
     <w:p>
@@ -270,7 +270,7 @@
           <w:sz w:val="22"/>
           <w:szCs w:val="22"/>
         </w:rPr>
-        <w:t>Mi impresión es que UrbanPulse no necesita reinventarse por completo. Necesita moverse unos pasos más allá de donde está. Hoy ya puede mostrar visibilidad; ahora tiene que probar que esa visibilidad ordena mejor la operación, baja tiempos de respuesta y se integra sin romper el trabajo cotidiano de quienes están adentro del municipio. Si consigue eso en uno o dos casos bien elegidos, va a tener algo mucho más fuerte que un buen discurso comercial. Va a tener evidencia.</w:t>
+        <w:t>Mi impresión es bastante concreta: UrbanPulse debería elegir uno o dos frentes donde pueda mostrar resultado rápido, meterse en la operación diaria sin volverla más pesada y probar que su sistema realmente acorta tiempos o ordena mejor el trabajo. Si eso aparece, después hay margen para crecer. Si no aparece, da igual cuántas funciones agregue. El problema va a seguir ahí.</w:t>
       </w:r>
     </w:p>
     <w:p>
@@ -321,7 +321,7 @@
           <w:sz w:val="22"/>
           <w:szCs w:val="22"/>
         </w:rPr>
-        <w:t xml:space="preserve"> El desafío de UrbanPulse no es solamente técnico. También es organizacional y político. Tiene que entrar en estructuras lentas, con hábitos viejos, recursos finitos y bastante sensibilidad al error. Justamente por eso, si logra que el producto funcione en ese terreno, el valor que construya puede ser muy difícil de reemplazar.</w:t>
+        <w:t xml:space="preserve"> UrbanPulse tiene un buen punto de partida. Lo que viene ahora es bastante menos prolijo: meterse en estructuras lentas, con hábitos viejos, recursos finitos y poca tolerancia al error. Si logra funcionar ahí, probablemente tenga algo valioso. Si no, se va a quedar en un dashboard mejor presentado. Y eso ya se vio varias veces.</w:t>
       </w:r>
     </w:p>
     <w:sectPr>

</xml_diff>